<commit_message>
docs: add Windows download and real Plot Docs screenshots
Refresh bundled templates without legacy branding, add the Windows EXE download link, and include screenshots of every editor plus the local account flow.
</commit_message>
<xml_diff>
--- a/apps/shell/resources/templates/Business Report.docx
+++ b/apps/shell/resources/templates/Business Report.docx
@@ -87,7 +87,7 @@
           <w:color w:val="667085"/>
           <w:sz w:val="16"/>
         </w:rPr>
-        <w:t>PREPARED WITH PLOT DOCS SUITE   •   EDIT EVERY SECTION   •   SAVE AS DOCX OR PDF</w:t>
+        <w:t>PREPARED WITH PLOT DOCS   •   EDIT EVERY SECTION   •   SAVE AS DOCX OR PDF</w:t>
       </w:r>
     </w:p>
     <w:p>
@@ -1556,7 +1556,7 @@
         <w:color w:val="667085"/>
         <w:sz w:val="16"/>
       </w:rPr>
-      <w:t xml:space="preserve">PLOT DOCS SUITE  /  </w:t>
+      <w:t xml:space="preserve">PLOT DOCS  /  </w:t>
     </w:r>
     <w:r>
       <w:rPr>

</xml_diff>